<commit_message>
Demo ready - fix next steps.
</commit_message>
<xml_diff>
--- a/docassemble/MACaregiverAuthorization/data/templates/temporary_agent_esp_2_next_steps.docx
+++ b/docassemble/MACaregiverAuthorization/data/templates/temporary_agent_esp_2_next_steps.docx
@@ -21,36 +21,7 @@
     </w:p>
     <w:p>
       <w:r>
-        <w:t xml:space="preserve">Congratulations </w:t>
-      </w:r>
-      <w:r>
-        <w:t>{_{ users }_}</w:t>
-      </w:r>
-      <w:r>
-        <w:t>! You have finished all the forms you need to {{ al_next_s</w:t>
-      </w:r>
-      <w:r>
-        <w:t>t</w:t>
-      </w:r>
-      <w:r>
-        <w:t>eps_intro_prompt }}. The rest of the pages </w:t>
-      </w:r>
-      <w:r>
-        <w:t>in this packet are your complet</w:t>
-      </w:r>
-      <w:r>
-        <w:t xml:space="preserve">ed</w:t>
-      </w:r>
-      <w:r>
-        <w:rPr>
-          <w:rStyle w:val="pl-s"/>
-        </w:rPr>
-        <w:t> {{ al_next_steps_document_title }}</w:t>
-      </w:r>
-      <w:bookmarkStart w:id="0" w:name="_GoBack"/>
-      <w:bookmarkEnd w:id="0"/>
-      <w:r>
-        <w:t xml:space="preserve">.</w:t>
+        <w:t xml:space="preserve">Congratulations {{ users[0] }}! You have finished the questions for your Temporary Agent Appointment. The rest of the pages in this packet are your completed form.</w:t>
       </w:r>
     </w:p>
     <w:p/>
@@ -71,10 +42,8 @@
       <w:pPr>
         <w:pStyle w:val="Heading2"/>
       </w:pPr>
-      <w:bookmarkStart w:id="1" w:name="_yntzxzfdh9ya"/>
-      <w:bookmarkEnd w:id="1"/>
-      <w:r>
-        <w:t>Next steps</w:t>
+      <w:r>
+        <w:t xml:space="preserve">Next steps</w:t>
       </w:r>
     </w:p>
     <w:p>
@@ -84,65 +53,9 @@
           <w:ilvl w:val="0"/>
           <w:numId w:val="1"/>
         </w:numPr>
-        <w:suppressAutoHyphens/>
-        <w:snapToGrid w:val="0"/>
-        <w:rPr>
-          <w14:textOutline w14:w="9525" w14:cap="rnd" w14:cmpd="sng" w14:algn="ctr">
-            <w14:noFill/>
-            <w14:prstDash w14:val="solid"/>
-            <w14:bevel/>
-          </w14:textOutline>
-        </w:rPr>
-      </w:pPr>
-      <w:r>
-        <w:rPr>
-          <w14:textOutline w14:w="9525" w14:cap="rnd" w14:cmpd="sng" w14:algn="ctr">
-            <w14:noFill/>
-            <w14:prstDash w14:val="solid"/>
-            <w14:bevel/>
-          </w14:textOutline>
-        </w:rPr>
-        <w:t xml:space="preserve">Deliver a copy to </w:t>
-      </w:r>
-      <w:r>
-        <w:rPr>
-          <w14:textOutline w14:w="9525" w14:cap="rnd" w14:cmpd="sng" w14:algn="ctr">
-            <w14:noFill/>
-            <w14:prstDash w14:val="solid"/>
-            <w14:bevel/>
-          </w14:textOutline>
-        </w:rPr>
-        <w:t xml:space="preserve">{_{ </w:t>
-      </w:r>
-      <w:r>
-        <w:rPr>
-          <w14:textOutline w14:w="9525" w14:cap="rnd" w14:cmpd="sng" w14:algn="ctr">
-            <w14:noFill/>
-            <w14:prstDash w14:val="solid"/>
-            <w14:bevel/>
-          </w14:textOutline>
-        </w:rPr>
-        <w:t xml:space="preserve">showifdef('other_parties[0]') </w:t>
-      </w:r>
-      <w:r>
-        <w:rPr>
-          <w14:textOutline w14:w="9525" w14:cap="rnd" w14:cmpd="sng" w14:algn="ctr">
-            <w14:noFill/>
-            <w14:prstDash w14:val="solid"/>
-            <w14:bevel/>
-          </w14:textOutline>
-        </w:rPr>
-        <w:t>}_}</w:t>
-      </w:r>
-      <w:r>
-        <w:rPr>
-          <w14:textOutline w14:w="9525" w14:cap="rnd" w14:cmpd="sng" w14:algn="ctr">
-            <w14:noFill/>
-            <w14:prstDash w14:val="solid"/>
-            <w14:bevel/>
-          </w14:textOutline>
-        </w:rPr>
-        <w:t xml:space="preserve"> or their attorney.</w:t>
+      </w:pPr>
+      <w:r>
+        <w:t xml:space="preserve">Read the form one more time. Make sure the names, addresses, and dates are correct.</w:t>
       </w:r>
     </w:p>
     <w:p>
@@ -152,29 +65,9 @@
           <w:ilvl w:val="0"/>
           <w:numId w:val="1"/>
         </w:numPr>
-        <w:suppressAutoHyphens/>
-        <w:snapToGrid w:val="0"/>
-        <w:rPr>
-          <w:b/>
-          <w:bCs/>
-          <w14:textOutline w14:w="9525" w14:cap="rnd" w14:cmpd="sng" w14:algn="ctr">
-            <w14:noFill/>
-            <w14:prstDash w14:val="solid"/>
-            <w14:bevel/>
-          </w14:textOutline>
-        </w:rPr>
-      </w:pPr>
-      <w:r>
-        <w:rPr>
-          <w:b/>
-          <w:bCs/>
-          <w14:textOutline w14:w="9525" w14:cap="rnd" w14:cmpd="sng" w14:algn="ctr">
-            <w14:noFill/>
-            <w14:prstDash w14:val="solid"/>
-            <w14:bevel/>
-          </w14:textOutline>
-        </w:rPr>
-        <w:t>Keep a copy for yourself.</w:t>
+      </w:pPr>
+      <w:r>
+        <w:t xml:space="preserve">Print the form. Sign it while two witnesses watch. Each witness must be at least 18 years old. Your agent cannot be a witness.</w:t>
       </w:r>
     </w:p>
     <w:p>
@@ -184,103 +77,80 @@
           <w:ilvl w:val="0"/>
           <w:numId w:val="1"/>
         </w:numPr>
-        <w:snapToGrid w:val="0"/>
-        <w:rPr>
-          <w14:textOutline w14:w="9525" w14:cap="rnd" w14:cmpd="sng" w14:algn="ctr">
-            <w14:noFill/>
-            <w14:prstDash w14:val="solid"/>
-            <w14:bevel/>
-          </w14:textOutline>
-        </w:rPr>
-      </w:pPr>
-      <w:r>
-        <w:rPr>
-          <w14:textOutline w14:w="9525" w14:cap="rnd" w14:cmpd="sng" w14:algn="ctr">
-            <w14:noFill/>
-            <w14:prstDash w14:val="solid"/>
-            <w14:bevel/>
-          </w14:textOutline>
-        </w:rPr>
-        <w:t xml:space="preserve">Wait for a response from </w:t>
-      </w:r>
-      <w:r>
-        <w:rPr>
-          <w14:textOutline w14:w="9525" w14:cap="rnd" w14:cmpd="sng" w14:algn="ctr">
-            <w14:noFill/>
-            <w14:prstDash w14:val="solid"/>
-            <w14:bevel/>
-          </w14:textOutline>
-        </w:rPr>
-        <w:t xml:space="preserve">{_{ </w:t>
-      </w:r>
-      <w:r>
-        <w:rPr>
-          <w14:textOutline w14:w="9525" w14:cap="rnd" w14:cmpd="sng" w14:algn="ctr">
-            <w14:noFill/>
-            <w14:prstDash w14:val="solid"/>
-            <w14:bevel/>
-          </w14:textOutline>
-        </w:rPr>
-        <w:t xml:space="preserve">showifdef('other_parties[0]') </w:t>
-      </w:r>
-      <w:r>
-        <w:rPr>
-          <w14:textOutline w14:w="9525" w14:cap="rnd" w14:cmpd="sng" w14:algn="ctr">
-            <w14:noFill/>
-            <w14:prstDash w14:val="solid"/>
-            <w14:bevel/>
-          </w14:textOutline>
-        </w:rPr>
-        <w:t>}_}</w:t>
-      </w:r>
-      <w:r>
-        <w:t>.</w:t>
-      </w:r>
-    </w:p>
-    <w:p>
-      <w:pPr>
-        <w:pStyle w:val="Heading2"/>
-      </w:pPr>
-      <w:bookmarkStart w:id="2" w:name="_4szgtqe6ov1h"/>
-      <w:bookmarkEnd w:id="2"/>
-      <w:r>
-        <w:t>What happens next?</w:t>
-      </w:r>
-    </w:p>
-    <w:p>
-      <w:pPr>
-        <w:pStyle w:val="NumberedList"/>
+      </w:pPr>
+      <w:r>
+        <w:t xml:space="preserve">Have your agent sign the form.</w:t>
+      </w:r>
+    </w:p>
+    <w:p>
+      <w:r>
+        <w:t xml:space="preserve">{%p if defined('non_appointing_parent_has_given_consent') and non_appointing_parent_has_given_consent %}</w:t>
+      </w:r>
+    </w:p>
+    <w:p>
+      <w:pPr>
+        <w:pStyle w:val="ListParagraph"/>
         <w:numPr>
           <w:ilvl w:val="0"/>
-          <w:numId w:val="3"/>
+          <w:numId w:val="1"/>
         </w:numPr>
       </w:pPr>
       <w:r>
-        <w:t xml:space="preserve">Look over the forms below, one more time. Make sure everything is correct. </w:t>
-      </w:r>
-    </w:p>
-    <w:p>
-      <w:pPr>
-        <w:pStyle w:val="NumberedList"/>
+        <w:t xml:space="preserve">Have the other parent sign the form to show they agree.</w:t>
+      </w:r>
+    </w:p>
+    <w:p>
+      <w:r>
+        <w:t xml:space="preserve">{%p endif %}</w:t>
+      </w:r>
+    </w:p>
+    <w:p>
+      <w:pPr>
+        <w:pStyle w:val="ListParagraph"/>
         <w:numPr>
           <w:ilvl w:val="0"/>
-          <w:numId w:val="3"/>
+          <w:numId w:val="1"/>
         </w:numPr>
       </w:pPr>
       <w:r>
-        <w:t xml:space="preserve">{%p if </w:t>
-      </w:r>
-      <w:r>
-        <w:t>al_next_steps_enabled and al_n</w:t>
-      </w:r>
-      <w:r>
-        <w:t xml:space="preserve">ext_s</w:t>
-      </w:r>
-      <w:r>
-        <w:t>teps_what_happens_next %}</w:t>
-      </w:r>
-      <w:r>
-        <w:t xml:space="preserve"/>
+        <w:t xml:space="preserve">Have the form notarized.</w:t>
+      </w:r>
+    </w:p>
+    <w:p>
+      <w:pPr>
+        <w:pStyle w:val="ListParagraph"/>
+        <w:numPr>
+          <w:ilvl w:val="0"/>
+          <w:numId w:val="1"/>
+        </w:numPr>
+      </w:pPr>
+      <w:r>
+        <w:rPr>
+          <w:b/>
+          <w:bCs/>
+        </w:rPr>
+        <w:t xml:space="preserve">Keep a copy for yourself. </w:t>
+      </w:r>
+      <w:r>
+        <w:t xml:space="preserve">Give a copy to your agent, {{ showifdef('temp_agent_printed_name') }}{% if showifdef('optional_agent_printed_name') %}, and to your backup agent, {{ showifdef('optional_agent_printed_name') }}{% endif %}.</w:t>
+      </w:r>
+    </w:p>
+    <w:p>
+      <w:pPr>
+        <w:pStyle w:val="Heading2"/>
+      </w:pPr>
+      <w:r>
+        <w:t xml:space="preserve">What happens next?</w:t>
+      </w:r>
+    </w:p>
+    <w:p>
+      <w:r>
+        <w:t xml:space="preserve">{%p if al_next_steps_enabled and al_next_steps_what_happens_next %}</w:t>
+      </w:r>
+    </w:p>
+    <w:p>
+      <w:r>
+        <w:t xml:space="preserve">{%p for line in al_next_steps_what_happens_next.split("\n") %}</w:t>
       </w:r>
     </w:p>
     <w:p>
@@ -292,112 +162,35 @@
         </w:numPr>
       </w:pPr>
       <w:r>
-        <w:t xml:space="preserve">{%p for line in </w:t>
-      </w:r>
-      <w:r>
-        <w:t>al_next_steps_what_happens_next.split("\n") %}</w:t>
-      </w:r>
-      <w:r>
-        <w:t/>
-      </w:r>
-    </w:p>
-    <w:p>
-      <w:pPr>
-        <w:pStyle w:val="ListParagraph"/>
-        <w:numPr>
-          <w:ilvl w:val="0"/>
-          <w:numId w:val="3"/>
-        </w:numPr>
-      </w:pPr>
-      <w:r>
-        <w:t>{{ fix_punctuation(line) }}</w:t>
-      </w:r>
-    </w:p>
-    <w:p>
-      <w:pPr>
-        <w:pStyle w:val="ListParagraph"/>
-        <w:numPr>
-          <w:ilvl w:val="0"/>
-          <w:numId w:val="3"/>
-        </w:numPr>
-      </w:pPr>
-      <w:r>
-        <w:t>{%p endfor %}</w:t>
-      </w:r>
-    </w:p>
-    <w:p>
-      <w:pPr>
-        <w:pStyle w:val="ListParagraph"/>
-        <w:numPr>
-          <w:ilvl w:val="0"/>
-          <w:numId w:val="3"/>
-        </w:numPr>
-      </w:pPr>
-      <w:r>
-        <w:t>{%p endif %}</w:t>
+        <w:t xml:space="preserve">{{ fix_punctuation(line) }}</w:t>
+      </w:r>
+    </w:p>
+    <w:p>
+      <w:r>
+        <w:t xml:space="preserve">{%p endfor %}</w:t>
+      </w:r>
+    </w:p>
+    <w:p>
+      <w:r>
+        <w:t xml:space="preserve">{%p endif %}</w:t>
       </w:r>
     </w:p>
     <w:p>
       <w:pPr>
         <w:pStyle w:val="Heading2"/>
       </w:pPr>
-      <w:bookmarkStart w:id="3" w:name="_7jbtnvplu76"/>
-      <w:bookmarkEnd w:id="3"/>
-      <w:r>
-        <w:t xml:space="preserve">What can </w:t>
-      </w:r>
-      <w:r>
-        <w:t xml:space="preserve">{_{ </w:t>
-      </w:r>
-      <w:r>
-        <w:rPr>
-          <w14:textOutline w14:w="9525" w14:cap="rnd" w14:cmpd="sng" w14:algn="ctr">
-            <w14:noFill/>
-            <w14:prstDash w14:val="solid"/>
-            <w14:bevel/>
-          </w14:textOutline>
-        </w:rPr>
-        <w:t xml:space="preserve">showifdef('other_parties[0]') </w:t>
-      </w:r>
-      <w:r>
-        <w:rPr>
-          <w14:textOutline w14:w="9525" w14:cap="rnd" w14:cmpd="sng" w14:algn="ctr">
-            <w14:noFill/>
-            <w14:prstDash w14:val="solid"/>
-            <w14:bevel/>
-          </w14:textOutline>
-        </w:rPr>
-        <w:t>}_}</w:t>
-      </w:r>
-      <w:r>
-        <w:rPr>
-          <w14:textOutline w14:w="9525" w14:cap="rnd" w14:cmpd="sng" w14:algn="ctr">
-            <w14:noFill/>
-            <w14:prstDash w14:val="solid"/>
-            <w14:bevel/>
-          </w14:textOutline>
-        </w:rPr>
-        <w:t xml:space="preserve"> </w:t>
-      </w:r>
-      <w:r>
-        <w:t>do?</w:t>
-      </w:r>
-    </w:p>
-    <w:p>
-      <w:r>
-        <w:t xml:space="preserve">{%p if </w:t>
-      </w:r>
-      <w:r>
-        <w:t>al_next_steps_enabled and al_n</w:t>
-      </w:r>
-      <w:r>
-        <w:t xml:space="preserve">ext_s</w:t>
-      </w:r>
-      <w:r>
-        <w:t>teps_what_can_decision_maker_do %}</w:t>
-      </w:r>
-      <w:r>
-        <w:t xml:space="preserve"/>
+      <w:r>
+        <w:t xml:space="preserve">What can your agent do?</w:t>
+      </w:r>
+    </w:p>
+    <w:p>
+      <w:r>
+        <w:t xml:space="preserve">{%p if al_next_steps_enabled and al_next_steps_what_can_decision_maker_do %}</w:t>
+      </w:r>
+    </w:p>
+    <w:p>
+      <w:r>
+        <w:t xml:space="preserve">{%p for line in al_next_steps_what_can_decision_maker_do.split("\n") %}</w:t>
       </w:r>
     </w:p>
     <w:p>
@@ -407,47 +200,41 @@
           <w:ilvl w:val="0"/>
           <w:numId w:val="8"/>
         </w:numPr>
-        <w:ind w:left="360"/>
-      </w:pPr>
-      <w:r>
-        <w:t xml:space="preserve">{%p for line in </w:t>
-      </w:r>
-      <w:r>
-        <w:t>al_next_steps_what_can_decision_maker_do.split("\n") %}</w:t>
-      </w:r>
-      <w:r>
-        <w:t/>
-      </w:r>
-    </w:p>
-    <w:p>
-      <w:pPr>
-        <w:pStyle w:val="ListParagraph"/>
-        <w:numPr>
-          <w:ilvl w:val="0"/>
-          <w:numId w:val="8"/>
-        </w:numPr>
-        <w:ind w:left="360"/>
-      </w:pPr>
-      <w:r>
-        <w:t>{{ fix_punctuation(line) }}</w:t>
-      </w:r>
-    </w:p>
-    <w:p>
-      <w:pPr>
-        <w:pStyle w:val="ListParagraph"/>
-        <w:numPr>
-          <w:ilvl w:val="0"/>
-          <w:numId w:val="8"/>
-        </w:numPr>
-        <w:ind w:left="360"/>
-      </w:pPr>
-      <w:r>
-        <w:t>{%p endfor %}</w:t>
-      </w:r>
-    </w:p>
-    <w:p>
-      <w:r>
-        <w:t>{%p endif %}</w:t>
+      </w:pPr>
+      <w:r>
+        <w:t xml:space="preserve">{{ fix_punctuation(line) }}</w:t>
+      </w:r>
+    </w:p>
+    <w:p>
+      <w:r>
+        <w:t xml:space="preserve">{%p endfor %}</w:t>
+      </w:r>
+    </w:p>
+    <w:p>
+      <w:r>
+        <w:t xml:space="preserve">{%p endif %}</w:t>
+      </w:r>
+    </w:p>
+    <w:p>
+      <w:r>
+        <w:t xml:space="preserve">{%p if defined('prohibitive_acts') and prohibitive_acts %}</w:t>
+      </w:r>
+    </w:p>
+    <w:p>
+      <w:r>
+        <w:rPr>
+          <w:b/>
+          <w:bCs/>
+        </w:rPr>
+        <w:t xml:space="preserve">You told us your agent may not do this: </w:t>
+      </w:r>
+      <w:r>
+        <w:t xml:space="preserve">{{ single_paragraph(prohibitive_acts) }}</w:t>
+      </w:r>
+    </w:p>
+    <w:p>
+      <w:r>
+        <w:t xml:space="preserve">{%p endif %}</w:t>
       </w:r>
     </w:p>
     <w:p>
@@ -455,63 +242,17 @@
         <w:pStyle w:val="Heading2"/>
       </w:pPr>
       <w:r>
-        <w:t xml:space="preserve">What happens after </w:t>
-      </w:r>
-      <w:r>
-        <w:t xml:space="preserve">{_{ </w:t>
-      </w:r>
-      <w:r>
-        <w:rPr>
-          <w14:textOutline w14:w="9525" w14:cap="rnd" w14:cmpd="sng" w14:algn="ctr">
-            <w14:noFill/>
-            <w14:prstDash w14:val="solid"/>
-            <w14:bevel/>
-          </w14:textOutline>
-        </w:rPr>
-        <w:t xml:space="preserve">showifdef('other_parties[0]') </w:t>
-      </w:r>
-      <w:r>
-        <w:rPr>
-          <w14:textOutline w14:w="9525" w14:cap="rnd" w14:cmpd="sng" w14:algn="ctr">
-            <w14:noFill/>
-            <w14:prstDash w14:val="solid"/>
-            <w14:bevel/>
-          </w14:textOutline>
-        </w:rPr>
-        <w:t>}_}</w:t>
-      </w:r>
-      <w:r>
-        <w:t xml:space="preserve"> </w:t>
-      </w:r>
-      <w:proofErr w:type="gramStart"/>
-      <w:r>
-        <w:t>makes a decision</w:t>
-      </w:r>
-      <w:proofErr w:type="gramEnd"/>
-      <w:r>
-        <w:t>?</w:t>
-      </w:r>
-    </w:p>
-    <w:p>
-      <w:r>
-        <w:t>If the judge decides to grant your appeal:</w:t>
-      </w:r>
-    </w:p>
-    <w:p>
-      <w:r>
-        <w:t xml:space="preserve">{%p if </w:t>
-      </w:r>
-      <w:r>
-        <w:t>al_next_steps_enabled and al_n</w:t>
-      </w:r>
-      <w:r>
-        <w:t xml:space="preserve">ext_s</w:t>
-      </w:r>
-      <w:r>
-        <w:t>teps_what_can_decision_maker_do %}</w:t>
-      </w:r>
-      <w:r>
-        <w:t xml:space="preserve"/>
+        <w:t xml:space="preserve">What if something changes?</w:t>
+      </w:r>
+    </w:p>
+    <w:p>
+      <w:r>
+        <w:t xml:space="preserve">{%p if al_next_steps_enabled and al_next_steps_what_happens_if_i_win %}</w:t>
+      </w:r>
+    </w:p>
+    <w:p>
+      <w:r>
+        <w:t xml:space="preserve">{%p for line in al_next_steps_what_happens_if_i_win.split("\n") %}</w:t>
       </w:r>
     </w:p>
     <w:p>
@@ -521,65 +262,31 @@
           <w:ilvl w:val="0"/>
           <w:numId w:val="9"/>
         </w:numPr>
-        <w:ind w:left="360"/>
-      </w:pPr>
-      <w:r>
-        <w:t xml:space="preserve">{%p for line in </w:t>
-      </w:r>
-      <w:r>
-        <w:t>al_next_steps_what_happens_if_i_win.split("\n") %}</w:t>
-      </w:r>
-      <w:r>
-        <w:t/>
-      </w:r>
-    </w:p>
-    <w:p>
-      <w:pPr>
-        <w:pStyle w:val="ListParagraph"/>
-        <w:numPr>
-          <w:ilvl w:val="0"/>
-          <w:numId w:val="9"/>
-        </w:numPr>
-        <w:ind w:left="360"/>
-      </w:pPr>
-      <w:r>
-        <w:t>{{ fix_punctuation(line) }}</w:t>
-      </w:r>
-    </w:p>
-    <w:p>
-      <w:pPr>
-        <w:pStyle w:val="ListParagraph"/>
-        <w:numPr>
-          <w:ilvl w:val="0"/>
-          <w:numId w:val="9"/>
-        </w:numPr>
-        <w:ind w:left="360"/>
-      </w:pPr>
-      <w:r>
-        <w:t>{%p endfor %}</w:t>
-      </w:r>
-    </w:p>
-    <w:p>
-      <w:r>
-        <w:t>{%p endif %}</w:t>
-      </w:r>
-    </w:p>
-    <w:p>
-      <w:pPr>
+      </w:pPr>
+      <w:r>
+        <w:t xml:space="preserve">{{ fix_punctuation(line) }}</w:t>
+      </w:r>
+    </w:p>
+    <w:p>
+      <w:r>
+        <w:t xml:space="preserve">{%p endfor %}</w:t>
+      </w:r>
+    </w:p>
+    <w:p>
+      <w:r>
+        <w:t xml:space="preserve">{%p endif %}</w:t>
+      </w:r>
+    </w:p>
+    <w:p>
+      <w:r>
         <w:rPr>
           <w:b/>
+          <w:bCs/>
         </w:rPr>
-      </w:pPr>
-    </w:p>
-    <w:p>
-      <w:r>
-        <w:rPr>
-          <w:b/>
-        </w:rPr>
-        <w:t xml:space="preserve">Read </w:t>
-      </w:r>
-      <w:r>
-        <w:t>the response as soon as you get it. If you have questions, {{ al_next_steps_help_organization or "Your local legal aid" }} may be able to help you more.</w:t>
+        <w:t xml:space="preserve">Questions? </w:t>
+      </w:r>
+      <w:r>
+        <w:t xml:space="preserve">{{ al_next_steps_help_organization or "Your local legal aid" }} may be able to help you.</w:t>
       </w:r>
     </w:p>
     <w:p>
@@ -675,7 +382,7 @@
         <w:t>="1in", alt_text="al_next</w:t>
       </w:r>
       <w:r>
-        <w:t>_steps_help_url") | markdown </w:t>
+        <w:t xml:space="preserve">_steps_help_url") | markdown </w:t>
       </w:r>
       <w:r>
         <w:t>}</w:t>

</xml_diff>

<commit_message>
Update with demo edits - need to add additional family plan packet.
</commit_message>
<xml_diff>
--- a/docassemble/MACaregiverAuthorization/data/templates/temporary_agent_esp_2_next_steps.docx
+++ b/docassemble/MACaregiverAuthorization/data/templates/temporary_agent_esp_2_next_steps.docx
@@ -21,7 +21,7 @@
     </w:p>
     <w:p>
       <w:r>
-        <w:t xml:space="preserve">Congratulations {{ users[0] }}! You have finished the questions for your Temporary Agent Appointment. The rest of the pages in this packet are your completed form.</w:t>
+        <w:t xml:space="preserve">Congratulations {{ users[0] }}! You have finished the questions for your Temporary Agent Appointment. The rest of the pages in this packet are your completed form. You selected {{ showifdef('temp_agent_printed_name') }}{% if showifdef('optional_agent_printed_name') %} and {{ showifdef('optional_agent_printed_name') }} as your agents{% else %} as your agent{% endif %}.</w:t>
       </w:r>
     </w:p>
     <w:p/>
@@ -41,6 +41,7 @@
     <w:p>
       <w:pPr>
         <w:pStyle w:val="Heading2"/>
+        <w:keepNext/>
       </w:pPr>
       <w:r>
         <w:t xml:space="preserve">Next steps</w:t>
@@ -67,7 +68,7 @@
         </w:numPr>
       </w:pPr>
       <w:r>
-        <w:t xml:space="preserve">Print the form. Sign it while two witnesses watch. Each witness must be at least 18 years old. Your agent cannot be a witness.</w:t>
+        <w:t xml:space="preserve">Print the form.</w:t>
       </w:r>
     </w:p>
     <w:p>
@@ -79,12 +80,7 @@
         </w:numPr>
       </w:pPr>
       <w:r>
-        <w:t xml:space="preserve">Have your agent sign the form.</w:t>
-      </w:r>
-    </w:p>
-    <w:p>
-      <w:r>
-        <w:t xml:space="preserve">{%p if defined('non_appointing_parent_has_given_consent') and non_appointing_parent_has_given_consent %}</w:t>
+        <w:t xml:space="preserve">If the other parent agrees to the form, please have them sign. They do not need to sign in front of the witnesses or notary.</w:t>
       </w:r>
     </w:p>
     <w:p>
@@ -96,12 +92,7 @@
         </w:numPr>
       </w:pPr>
       <w:r>
-        <w:t xml:space="preserve">Have the other parent sign the form to show they agree.</w:t>
-      </w:r>
-    </w:p>
-    <w:p>
-      <w:r>
-        <w:t xml:space="preserve">{%p endif %}</w:t>
+        <w:t xml:space="preserve">Sign the form while two witnesses watch. Each witness must be at least 18 years old. Your agent cannot be a witness.</w:t>
       </w:r>
     </w:p>
     <w:p>
@@ -113,7 +104,7 @@
         </w:numPr>
       </w:pPr>
       <w:r>
-        <w:t xml:space="preserve">Have the form notarized.</w:t>
+        <w:t xml:space="preserve">Have your agent(s) sign the form.</w:t>
       </w:r>
     </w:p>
     <w:p>
@@ -125,32 +116,48 @@
         </w:numPr>
       </w:pPr>
       <w:r>
-        <w:rPr>
-          <w:b/>
-          <w:bCs/>
-        </w:rPr>
-        <w:t xml:space="preserve">Keep a copy for yourself. </w:t>
-      </w:r>
-      <w:r>
-        <w:t xml:space="preserve">Give a copy to your agent, {{ showifdef('temp_agent_printed_name') }}{% if showifdef('optional_agent_printed_name') %}, and to your backup agent, {{ showifdef('optional_agent_printed_name') }}{% endif %}.</w:t>
+        <w:t xml:space="preserve">Have the form notarized.</w:t>
+      </w:r>
+    </w:p>
+    <w:p>
+      <w:pPr>
+        <w:pStyle w:val="ListParagraph"/>
+        <w:numPr>
+          <w:ilvl w:val="0"/>
+          <w:numId w:val="1"/>
+        </w:numPr>
+      </w:pPr>
+      <w:r>
+        <w:t xml:space="preserve">Keep a copy for yourself. Give a copy to your agent.</w:t>
+      </w:r>
+    </w:p>
+    <w:p>
+      <w:pPr>
+        <w:pStyle w:val="ListParagraph"/>
+        <w:numPr>
+          <w:ilvl w:val="0"/>
+          <w:numId w:val="1"/>
+        </w:numPr>
+      </w:pPr>
+      <w:r>
+        <w:t xml:space="preserve">Share copies with important people. Your agent should give a copy to your child’s school, doctor, dentist, and other people or organizations that may need it.</w:t>
+      </w:r>
+    </w:p>
+    <w:p>
+      <w:pPr>
+        <w:ind w:left="360"/>
+      </w:pPr>
+      <w:r>
+        <w:t xml:space="preserve">Keep a list of everyone who receives a copy. You may need to contact them if you change or end the appointment.</w:t>
       </w:r>
     </w:p>
     <w:p>
       <w:pPr>
         <w:pStyle w:val="Heading2"/>
+        <w:keepNext/>
       </w:pPr>
       <w:r>
         <w:t xml:space="preserve">What happens next?</w:t>
-      </w:r>
-    </w:p>
-    <w:p>
-      <w:r>
-        <w:t xml:space="preserve">{%p if al_next_steps_enabled and al_next_steps_what_happens_next %}</w:t>
-      </w:r>
-    </w:p>
-    <w:p>
-      <w:r>
-        <w:t xml:space="preserve">{%p for line in al_next_steps_what_happens_next.split("\n") %}</w:t>
       </w:r>
     </w:p>
     <w:p>
@@ -162,35 +169,7 @@
         </w:numPr>
       </w:pPr>
       <w:r>
-        <w:t xml:space="preserve">{{ fix_punctuation(line) }}</w:t>
-      </w:r>
-    </w:p>
-    <w:p>
-      <w:r>
-        <w:t xml:space="preserve">{%p endfor %}</w:t>
-      </w:r>
-    </w:p>
-    <w:p>
-      <w:r>
-        <w:t xml:space="preserve">{%p endif %}</w:t>
-      </w:r>
-    </w:p>
-    <w:p>
-      <w:pPr>
-        <w:pStyle w:val="Heading2"/>
-      </w:pPr>
-      <w:r>
-        <w:t xml:space="preserve">What can your agent do?</w:t>
-      </w:r>
-    </w:p>
-    <w:p>
-      <w:r>
-        <w:t xml:space="preserve">{%p if al_next_steps_enabled and al_next_steps_what_can_decision_maker_do %}</w:t>
-      </w:r>
-    </w:p>
-    <w:p>
-      <w:r>
-        <w:t xml:space="preserve">{%p for line in al_next_steps_what_can_decision_maker_do.split("\n") %}</w:t>
+        <w:t xml:space="preserve">After filling out the form, make sure you have all the signatures, including those of witnesses and the agent. Give copies to everyone involved and keep a copy for yourself.</w:t>
       </w:r>
     </w:p>
     <w:p>
@@ -198,21 +177,126 @@
         <w:pStyle w:val="ListParagraph"/>
         <w:numPr>
           <w:ilvl w:val="0"/>
-          <w:numId w:val="8"/>
+          <w:numId w:val="3"/>
         </w:numPr>
       </w:pPr>
       <w:r>
-        <w:t xml:space="preserve">{{ fix_punctuation(line) }}</w:t>
-      </w:r>
-    </w:p>
-    <w:p>
-      <w:r>
-        <w:t xml:space="preserve">{%p endfor %}</w:t>
-      </w:r>
-    </w:p>
-    <w:p>
-      <w:r>
-        <w:t xml:space="preserve">{%p endif %}</w:t>
+        <w:t xml:space="preserve">Read the form carefully to understand when your agent’s authority begins. The appointment lasts for up to 60 days. You may need to complete a new form if you need more time.</w:t>
+      </w:r>
+    </w:p>
+    <w:p>
+      <w:pPr>
+        <w:pStyle w:val="ListParagraph"/>
+        <w:numPr>
+          <w:ilvl w:val="0"/>
+          <w:numId w:val="3"/>
+        </w:numPr>
+      </w:pPr>
+      <w:r>
+        <w:t xml:space="preserve">You do not need to go to court or file this form with a court.</w:t>
+      </w:r>
+    </w:p>
+    <w:p>
+      <w:pPr>
+        <w:pStyle w:val="Heading2"/>
+        <w:keepNext/>
+      </w:pPr>
+      <w:r>
+        <w:t xml:space="preserve">What can your agent do?</w:t>
+      </w:r>
+    </w:p>
+    <w:p>
+      <w:pPr>
+        <w:keepNext/>
+      </w:pPr>
+      <w:r>
+        <w:t xml:space="preserve">Your agent may make decisions about your child’s care, depending on the powers you give them in the form. These decisions may include:</w:t>
+      </w:r>
+    </w:p>
+    <w:p>
+      <w:pPr>
+        <w:pStyle w:val="ListParagraph"/>
+        <w:numPr>
+          <w:ilvl w:val="0"/>
+          <w:numId w:val="20"/>
+        </w:numPr>
+      </w:pPr>
+      <w:r>
+        <w:rPr>
+          <w:b/>
+          <w:bCs/>
+        </w:rPr>
+        <w:t xml:space="preserve">Daily care: </w:t>
+      </w:r>
+      <w:r>
+        <w:t xml:space="preserve">Help care for your child and decide where your child will stay.</w:t>
+      </w:r>
+    </w:p>
+    <w:p>
+      <w:pPr>
+        <w:pStyle w:val="ListParagraph"/>
+        <w:numPr>
+          <w:ilvl w:val="0"/>
+          <w:numId w:val="20"/>
+        </w:numPr>
+      </w:pPr>
+      <w:r>
+        <w:rPr>
+          <w:b/>
+          <w:bCs/>
+        </w:rPr>
+        <w:t xml:space="preserve">Medical care: </w:t>
+      </w:r>
+      <w:r>
+        <w:t xml:space="preserve">Make decisions about your child’s health care.</w:t>
+      </w:r>
+    </w:p>
+    <w:p>
+      <w:pPr>
+        <w:pStyle w:val="ListParagraph"/>
+        <w:numPr>
+          <w:ilvl w:val="0"/>
+          <w:numId w:val="20"/>
+        </w:numPr>
+      </w:pPr>
+      <w:r>
+        <w:rPr>
+          <w:b/>
+          <w:bCs/>
+        </w:rPr>
+        <w:t xml:space="preserve">School: </w:t>
+      </w:r>
+      <w:r>
+        <w:t xml:space="preserve">Make decisions about your child’s education.</w:t>
+      </w:r>
+    </w:p>
+    <w:p>
+      <w:pPr>
+        <w:pStyle w:val="ListParagraph"/>
+        <w:numPr>
+          <w:ilvl w:val="0"/>
+          <w:numId w:val="20"/>
+        </w:numPr>
+      </w:pPr>
+      <w:r>
+        <w:rPr>
+          <w:b/>
+          <w:bCs/>
+        </w:rPr>
+        <w:t xml:space="preserve">Money and property: </w:t>
+      </w:r>
+      <w:r>
+        <w:t xml:space="preserve">Handle certain matters involving your child’s money or property, if allowed by the form.</w:t>
+      </w:r>
+    </w:p>
+    <w:p>
+      <w:r>
+        <w:t xml:space="preserve">Your agent cannot give permission for your child to get married or be adopted.</w:t>
+      </w:r>
+    </w:p>
+    <w:p>
+      <w:r>
+        <w:t xml:space="preserve">You can also limit the powers you give your agent by following the instructions on the form.</w:t>
       </w:r>
     </w:p>
     <w:p>
@@ -240,6 +324,7 @@
     <w:p>
       <w:pPr>
         <w:pStyle w:val="Heading2"/>
+        <w:keepNext/>
       </w:pPr>
       <w:r>
         <w:t xml:space="preserve">What if something changes?</w:t>
@@ -247,12 +332,19 @@
     </w:p>
     <w:p>
       <w:r>
-        <w:t xml:space="preserve">{%p if al_next_steps_enabled and al_next_steps_what_happens_if_i_win %}</w:t>
-      </w:r>
-    </w:p>
-    <w:p>
-      <w:r>
-        <w:t xml:space="preserve">{%p for line in al_next_steps_what_happens_if_i_win.split("\n") %}</w:t>
+        <w:t xml:space="preserve">You can change your mind after completing the form.</w:t>
+      </w:r>
+    </w:p>
+    <w:p>
+      <w:pPr>
+        <w:keepNext/>
+      </w:pPr>
+      <w:r>
+        <w:rPr>
+          <w:b/>
+          <w:bCs/>
+        </w:rPr>
+        <w:t xml:space="preserve">If you want to change your agent or the powers you gave them:</w:t>
       </w:r>
     </w:p>
     <w:p>
@@ -260,21 +352,81 @@
         <w:pStyle w:val="ListParagraph"/>
         <w:numPr>
           <w:ilvl w:val="0"/>
-          <w:numId w:val="9"/>
+          <w:numId w:val="20"/>
         </w:numPr>
       </w:pPr>
       <w:r>
-        <w:t xml:space="preserve">{{ fix_punctuation(line) }}</w:t>
-      </w:r>
-    </w:p>
-    <w:p>
-      <w:r>
-        <w:t xml:space="preserve">{%p endfor %}</w:t>
-      </w:r>
-    </w:p>
-    <w:p>
-      <w:r>
-        <w:t xml:space="preserve">{%p endif %}</w:t>
+        <w:t xml:space="preserve">Complete an updated form.</w:t>
+      </w:r>
+    </w:p>
+    <w:p>
+      <w:pPr>
+        <w:pStyle w:val="ListParagraph"/>
+        <w:numPr>
+          <w:ilvl w:val="0"/>
+          <w:numId w:val="20"/>
+        </w:numPr>
+      </w:pPr>
+      <w:r>
+        <w:t xml:space="preserve">Give the updated form to everyone who received the earlier form.</w:t>
+      </w:r>
+    </w:p>
+    <w:p>
+      <w:pPr>
+        <w:keepNext/>
+      </w:pPr>
+      <w:r>
+        <w:rPr>
+          <w:b/>
+          <w:bCs/>
+        </w:rPr>
+        <w:t xml:space="preserve">If you want to end the appointment:</w:t>
+      </w:r>
+    </w:p>
+    <w:p>
+      <w:pPr>
+        <w:pStyle w:val="ListParagraph"/>
+        <w:numPr>
+          <w:ilvl w:val="0"/>
+          <w:numId w:val="20"/>
+        </w:numPr>
+      </w:pPr>
+      <w:r>
+        <w:t xml:space="preserve">Complete a written notice ending the appointment.</w:t>
+      </w:r>
+    </w:p>
+    <w:p>
+      <w:pPr>
+        <w:pStyle w:val="ListParagraph"/>
+        <w:numPr>
+          <w:ilvl w:val="0"/>
+          <w:numId w:val="20"/>
+        </w:numPr>
+      </w:pPr>
+      <w:r>
+        <w:t xml:space="preserve">Give the notice to your agent and everyone else who received a copy.</w:t>
+      </w:r>
+    </w:p>
+    <w:p>
+      <w:r>
+        <w:t xml:space="preserve">Keep a copy of the notice for your records.</w:t>
+      </w:r>
+    </w:p>
+    <w:p>
+      <w:pPr>
+        <w:keepNext/>
+      </w:pPr>
+      <w:r>
+        <w:rPr>
+          <w:b/>
+          <w:bCs/>
+        </w:rPr>
+        <w:t xml:space="preserve">If you need your agent for longer than 60 days:</w:t>
+      </w:r>
+    </w:p>
+    <w:p>
+      <w:r>
+        <w:t xml:space="preserve">You must complete a new authorization. Do not assume the old form will continue to work.</w:t>
       </w:r>
     </w:p>
     <w:p>
@@ -286,7 +438,7 @@
         <w:t xml:space="preserve">Questions? </w:t>
       </w:r>
       <w:r>
-        <w:t xml:space="preserve">{{ al_next_steps_help_organization or "Your local legal aid" }} may be able to help you.</w:t>
+        <w:t xml:space="preserve">Massachusetts Legal Assistance may be able to help you.</w:t>
       </w:r>
     </w:p>
     <w:p>
@@ -1450,6 +1602,18 @@
       <w:rPr>
         <w:u w:val="none"/>
       </w:rPr>
+    </w:lvl>
+  </w:abstractNum>
+  <w:abstractNum w:abstractNumId="20">
+    <w:multiLevelType w:val="hybridMultilevel"/>
+    <w:lvl w:ilvl="0">
+      <w:start w:val="1"/>
+      <w:numFmt w:val="bullet"/>
+      <w:lvlText w:val="•"/>
+      <w:lvlJc w:val="left"/>
+      <w:pPr>
+        <w:ind w:left="720" w:hanging="360"/>
+      </w:pPr>
     </w:lvl>
   </w:abstractNum>
   <w:num w:numId="1">
@@ -1478,6 +1642,9 @@
   </w:num>
   <w:num w:numId="9">
     <w:abstractNumId w:val="6"/>
+  </w:num>
+  <w:num w:numId="20">
+    <w:abstractNumId w:val="20"/>
   </w:num>
 </w:numbering>
 </file>

</xml_diff>